<commit_message>
Pushed updates for Module 4.3 and other modified files
</commit_message>
<xml_diff>
--- a/module-3/Garcia-Module3.2 Assignment.docx
+++ b/module-3/Garcia-Module3.2 Assignment.docx
@@ -127,6 +127,9 @@
     <w:p/>
     <w:p>
       <w:r>
+        <w:rPr>
+          <w:noProof/>
+        </w:rPr>
         <w:drawing>
           <wp:inline distT="0" distB="0" distL="0" distR="0" wp14:anchorId="5331123B" wp14:editId="7DD2A102">
             <wp:extent cx="5943600" cy="3545205"/>
@@ -219,13 +222,7 @@
       </w:r>
       <w:r>
         <w:noBreakHyphen/>
-        <w:t xml:space="preserve">many </w:t>
-      </w:r>
-      <w:r>
-        <w:t>relationships</w:t>
-      </w:r>
-      <w:r>
-        <w:t xml:space="preserve"> between books and authors, which is required for 3NF.</w:t>
+        <w:t>many relationships between books and authors, which is required for 3NF.</w:t>
       </w:r>
     </w:p>
     <w:p/>
@@ -311,7 +308,45 @@
       </w:r>
     </w:p>
     <w:p/>
-    <w:p/>
+    <w:p>
+      <w:r>
+        <w:drawing>
+          <wp:inline distT="0" distB="0" distL="0" distR="0" wp14:anchorId="52CD6960" wp14:editId="08221F1C">
+            <wp:extent cx="5943600" cy="3467735"/>
+            <wp:effectExtent l="0" t="0" r="0" b="0"/>
+            <wp:docPr id="830571897" name="Picture 1"/>
+            <wp:cNvGraphicFramePr>
+              <a:graphicFrameLocks xmlns:a="http://schemas.openxmlformats.org/drawingml/2006/main" noChangeAspect="1"/>
+            </wp:cNvGraphicFramePr>
+            <a:graphic xmlns:a="http://schemas.openxmlformats.org/drawingml/2006/main">
+              <a:graphicData uri="http://schemas.openxmlformats.org/drawingml/2006/picture">
+                <pic:pic xmlns:pic="http://schemas.openxmlformats.org/drawingml/2006/picture">
+                  <pic:nvPicPr>
+                    <pic:cNvPr id="830571897" name=""/>
+                    <pic:cNvPicPr/>
+                  </pic:nvPicPr>
+                  <pic:blipFill>
+                    <a:blip r:embed="rId6"/>
+                    <a:stretch>
+                      <a:fillRect/>
+                    </a:stretch>
+                  </pic:blipFill>
+                  <pic:spPr>
+                    <a:xfrm>
+                      <a:off x="0" y="0"/>
+                      <a:ext cx="5943600" cy="3467735"/>
+                    </a:xfrm>
+                    <a:prstGeom prst="rect">
+                      <a:avLst/>
+                    </a:prstGeom>
+                  </pic:spPr>
+                </pic:pic>
+              </a:graphicData>
+            </a:graphic>
+          </wp:inline>
+        </w:drawing>
+      </w:r>
+    </w:p>
     <w:p/>
     <w:p/>
     <w:sectPr>
@@ -1176,6 +1211,7 @@
   <w:style w:type="character" w:default="1" w:styleId="DefaultParagraphFont">
     <w:name w:val="Default Paragraph Font"/>
     <w:uiPriority w:val="1"/>
+    <w:semiHidden/>
     <w:unhideWhenUsed/>
   </w:style>
   <w:style w:type="table" w:default="1" w:styleId="TableNormal">

</xml_diff>